<commit_message>
Logistic Regression pe 2 dataset-uri
</commit_message>
<xml_diff>
--- a/Raport.docx
+++ b/Raport.docx
@@ -210,31 +210,13 @@
           <w:w w:val="110"/>
         </w:rPr>
       </w:pPr>
-      <w:proofErr w:type="spellStart"/>
       <w:r>
         <w:rPr>
           <w:spacing w:val="-2"/>
           <w:w w:val="110"/>
         </w:rPr>
-        <w:t>Evolutia</w:t>
-      </w:r>
-      <w:proofErr w:type="spellEnd"/>
-      <w:r>
-        <w:rPr>
-          <w:spacing w:val="-2"/>
-          <w:w w:val="110"/>
-        </w:rPr>
-        <w:t xml:space="preserve"> </w:t>
-      </w:r>
-      <w:proofErr w:type="spellStart"/>
-      <w:r>
-        <w:rPr>
-          <w:spacing w:val="-2"/>
-          <w:w w:val="110"/>
-        </w:rPr>
-        <w:t>Gripei</w:t>
-      </w:r>
-      <w:proofErr w:type="spellEnd"/>
+        <w:t>Evolutia Gripei</w:t>
+      </w:r>
     </w:p>
     <w:p>
       <w:pPr>
@@ -452,16 +434,36 @@
         <w:spacing w:line="252" w:lineRule="auto"/>
         <w:ind w:left="5692"/>
         <w:rPr>
-          <w:sz w:val="27"/>
-        </w:rPr>
-      </w:pPr>
-      <w:r>
-        <w:rPr>
           <w:w w:val="105"/>
           <w:sz w:val="27"/>
         </w:rPr>
-        <w:t>Serpe Vlad, vladvladserpe@gmail.com</w:t>
-      </w:r>
+      </w:pPr>
+      <w:r>
+        <w:rPr>
+          <w:w w:val="105"/>
+          <w:sz w:val="27"/>
+        </w:rPr>
+        <w:t xml:space="preserve">Serpe Vlad, </w:t>
+      </w:r>
+      <w:hyperlink r:id="rId8" w:history="1">
+        <w:r>
+          <w:rPr>
+            <w:rStyle w:val="Hyperlink"/>
+            <w:w w:val="105"/>
+            <w:sz w:val="27"/>
+          </w:rPr>
+          <w:t>vladvladserpe@gmail.com</w:t>
+        </w:r>
+      </w:hyperlink>
+    </w:p>
+    <w:p>
+      <w:pPr>
+        <w:spacing w:line="252" w:lineRule="auto"/>
+        <w:ind w:left="5692"/>
+        <w:rPr>
+          <w:sz w:val="27"/>
+        </w:rPr>
+      </w:pPr>
     </w:p>
     <w:p>
       <w:pPr>
@@ -537,14 +539,33 @@
         <w:rPr>
           <w:w w:val="85"/>
         </w:rPr>
-        <w:t>2020-</w:t>
+        <w:t>202</w:t>
+      </w:r>
+      <w:r>
+        <w:rPr>
+          <w:w w:val="85"/>
+        </w:rPr>
+        <w:t>4</w:t>
+      </w:r>
+      <w:r>
+        <w:rPr>
+          <w:w w:val="85"/>
+        </w:rPr>
+        <w:t>-</w:t>
       </w:r>
       <w:r>
         <w:rPr>
           <w:spacing w:val="-4"/>
           <w:w w:val="95"/>
         </w:rPr>
-        <w:t>2021</w:t>
+        <w:t>202</w:t>
+      </w:r>
+      <w:r>
+        <w:rPr>
+          <w:spacing w:val="-4"/>
+          <w:w w:val="95"/>
+        </w:rPr>
+        <w:t>5</w:t>
       </w:r>
     </w:p>
     <w:p>
@@ -793,38 +814,15 @@
     <w:p>
       <w:pPr>
         <w:pStyle w:val="ListParagraph"/>
-        <w:numPr>
-          <w:ilvl w:val="0"/>
-          <w:numId w:val="8"/>
-        </w:numPr>
-        <w:rPr>
-          <w:sz w:val="28"/>
-          <w:szCs w:val="28"/>
-        </w:rPr>
-      </w:pPr>
-      <w:r>
-        <w:rPr>
-          <w:sz w:val="28"/>
-          <w:szCs w:val="28"/>
-        </w:rPr>
-        <w:t xml:space="preserve">In this project, a combination of machine learning and data science techniques will be used to identify predictors of immune response to influenza vaccination. Some of the techniques </w:t>
-      </w:r>
-      <w:proofErr w:type="gramStart"/>
-      <w:r>
-        <w:rPr>
-          <w:sz w:val="28"/>
-          <w:szCs w:val="28"/>
-        </w:rPr>
-        <w:t>are:</w:t>
-      </w:r>
-      <w:proofErr w:type="gramEnd"/>
-      <w:r>
-        <w:rPr>
-          <w:sz w:val="28"/>
-          <w:szCs w:val="28"/>
-        </w:rPr>
-        <w:t xml:space="preserve"> Feature Selection &amp; Dimensionality Reduction, Data Imputation, Normalization/Standardization. The machine learning algorithms that we use are Logistic Regression and Random Forest.</w:t>
-      </w:r>
+        <w:tabs>
+          <w:tab w:val="left" w:pos="698"/>
+        </w:tabs>
+        <w:spacing w:before="163"/>
+        <w:ind w:firstLine="0"/>
+        <w:rPr>
+          <w:sz w:val="25"/>
+        </w:rPr>
+      </w:pPr>
     </w:p>
     <w:p>
       <w:pPr>
@@ -842,16 +840,507 @@
         <w:rPr>
           <w:sz w:val="28"/>
           <w:szCs w:val="28"/>
-          <w:lang w:val="en-GB"/>
-        </w:rPr>
-        <w:t>data involved in the numerical experiments;</w:t>
-      </w:r>
-      <w:r>
-        <w:rPr>
+        </w:rPr>
+        <w:t xml:space="preserve">In this project, a combination of machine learning and data science techniques will be used to identify predictors of immune response to influenza vaccination. Some of the techniques are: </w:t>
+      </w:r>
+      <w:r>
+        <w:rPr>
+          <w:b/>
+          <w:bCs/>
           <w:sz w:val="28"/>
           <w:szCs w:val="28"/>
         </w:rPr>
-        <w:t xml:space="preserve"> The data involved in the numerical experiments can be classified in the following types: Demographic Data, Clinical Data, Immunological Data, Vaccine Response Data, Time-based Data.</w:t>
+        <w:t>Feature Selection &amp; Dimensionality Reduction, Data Imputation, Normalization/Standardization</w:t>
+      </w:r>
+      <w:r>
+        <w:rPr>
+          <w:sz w:val="28"/>
+          <w:szCs w:val="28"/>
+        </w:rPr>
+        <w:t xml:space="preserve">. The machine learning algorithms that we use are </w:t>
+      </w:r>
+      <w:r>
+        <w:rPr>
+          <w:b/>
+          <w:bCs/>
+          <w:sz w:val="28"/>
+          <w:szCs w:val="28"/>
+        </w:rPr>
+        <w:t>Logistic Regression</w:t>
+      </w:r>
+      <w:r>
+        <w:rPr>
+          <w:sz w:val="28"/>
+          <w:szCs w:val="28"/>
+        </w:rPr>
+        <w:t xml:space="preserve"> and</w:t>
+      </w:r>
+      <w:r>
+        <w:rPr>
+          <w:sz w:val="28"/>
+          <w:szCs w:val="28"/>
+        </w:rPr>
+        <w:t xml:space="preserve"> Decision Tree</w:t>
+      </w:r>
+    </w:p>
+    <w:p>
+      <w:pPr>
+        <w:pStyle w:val="ListParagraph"/>
+        <w:rPr>
+          <w:sz w:val="28"/>
+          <w:szCs w:val="28"/>
+        </w:rPr>
+      </w:pPr>
+    </w:p>
+    <w:p>
+      <w:pPr>
+        <w:pStyle w:val="ListParagraph"/>
+        <w:numPr>
+          <w:ilvl w:val="0"/>
+          <w:numId w:val="8"/>
+        </w:numPr>
+        <w:rPr>
+          <w:sz w:val="28"/>
+          <w:szCs w:val="28"/>
+        </w:rPr>
+      </w:pPr>
+      <w:r>
+        <w:rPr>
+          <w:sz w:val="28"/>
+          <w:szCs w:val="28"/>
+        </w:rPr>
+        <w:t>Data viitoare logistic de impartit bine pe test si train datele</w:t>
+      </w:r>
+    </w:p>
+    <w:p>
+      <w:pPr>
+        <w:pStyle w:val="ListParagraph"/>
+        <w:ind w:left="699" w:firstLine="0"/>
+        <w:rPr>
+          <w:sz w:val="28"/>
+          <w:szCs w:val="28"/>
+        </w:rPr>
+      </w:pPr>
+    </w:p>
+    <w:p>
+      <w:pPr>
+        <w:pStyle w:val="ListParagraph"/>
+        <w:numPr>
+          <w:ilvl w:val="0"/>
+          <w:numId w:val="8"/>
+        </w:numPr>
+        <w:rPr>
+          <w:sz w:val="28"/>
+          <w:szCs w:val="28"/>
+        </w:rPr>
+      </w:pPr>
+      <w:r>
+        <w:rPr>
+          <w:sz w:val="28"/>
+          <w:szCs w:val="28"/>
+          <w:lang w:val="en-GB"/>
+        </w:rPr>
+        <w:t>data involved in the numerical experiments;</w:t>
+      </w:r>
+      <w:r>
+        <w:rPr>
+          <w:sz w:val="28"/>
+          <w:szCs w:val="28"/>
+        </w:rPr>
+        <w:t xml:space="preserve"> The data involved in the numerical experiments can be classified in the following types: </w:t>
+      </w:r>
+      <w:r>
+        <w:rPr>
+          <w:b/>
+          <w:bCs/>
+          <w:sz w:val="28"/>
+          <w:szCs w:val="28"/>
+        </w:rPr>
+        <w:t>Demographic Data</w:t>
+      </w:r>
+      <w:r>
+        <w:rPr>
+          <w:sz w:val="28"/>
+          <w:szCs w:val="28"/>
+        </w:rPr>
+        <w:t xml:space="preserve"> (visit_age, gender, race)</w:t>
+      </w:r>
+      <w:r>
+        <w:rPr>
+          <w:sz w:val="28"/>
+          <w:szCs w:val="28"/>
+        </w:rPr>
+        <w:t xml:space="preserve">, </w:t>
+      </w:r>
+      <w:r>
+        <w:rPr>
+          <w:b/>
+          <w:bCs/>
+          <w:sz w:val="28"/>
+          <w:szCs w:val="28"/>
+        </w:rPr>
+        <w:t>Clinical Data</w:t>
+      </w:r>
+      <w:r>
+        <w:rPr>
+          <w:sz w:val="28"/>
+          <w:szCs w:val="28"/>
+        </w:rPr>
+        <w:t xml:space="preserve"> (bmi,</w:t>
+      </w:r>
+      <w:r>
+        <w:t xml:space="preserve"> </w:t>
+      </w:r>
+      <w:r>
+        <w:rPr>
+          <w:sz w:val="28"/>
+          <w:szCs w:val="28"/>
+        </w:rPr>
+        <w:t>total_vaccines_received</w:t>
+      </w:r>
+      <w:r>
+        <w:rPr>
+          <w:sz w:val="28"/>
+          <w:szCs w:val="28"/>
+        </w:rPr>
+        <w:t>,</w:t>
+      </w:r>
+      <w:r>
+        <w:t xml:space="preserve"> </w:t>
+      </w:r>
+      <w:r>
+        <w:rPr>
+          <w:sz w:val="28"/>
+          <w:szCs w:val="28"/>
+        </w:rPr>
+        <w:t>vaccinated_1yr_prior</w:t>
+      </w:r>
+      <w:r>
+        <w:rPr>
+          <w:sz w:val="28"/>
+          <w:szCs w:val="28"/>
+        </w:rPr>
+        <w:t>,</w:t>
+      </w:r>
+      <w:r>
+        <w:t xml:space="preserve"> </w:t>
+      </w:r>
+      <w:r>
+        <w:rPr>
+          <w:sz w:val="28"/>
+          <w:szCs w:val="28"/>
+        </w:rPr>
+        <w:t>vaccine_type_1yr_prior</w:t>
+      </w:r>
+      <w:r>
+        <w:rPr>
+          <w:sz w:val="28"/>
+          <w:szCs w:val="28"/>
+        </w:rPr>
+        <w:t>,</w:t>
+      </w:r>
+      <w:r>
+        <w:t xml:space="preserve"> </w:t>
+      </w:r>
+      <w:r>
+        <w:rPr>
+          <w:sz w:val="28"/>
+          <w:szCs w:val="28"/>
+        </w:rPr>
+        <w:t>influenza_infection_history</w:t>
+      </w:r>
+      <w:r>
+        <w:rPr>
+          <w:sz w:val="28"/>
+          <w:szCs w:val="28"/>
+        </w:rPr>
+        <w:t>,</w:t>
+      </w:r>
+      <w:r>
+        <w:t xml:space="preserve"> </w:t>
+      </w:r>
+      <w:r>
+        <w:rPr>
+          <w:sz w:val="28"/>
+          <w:szCs w:val="28"/>
+        </w:rPr>
+        <w:t>influenza_hospitalization</w:t>
+      </w:r>
+      <w:r>
+        <w:rPr>
+          <w:sz w:val="28"/>
+          <w:szCs w:val="28"/>
+        </w:rPr>
+        <w:t>)</w:t>
+      </w:r>
+      <w:r>
+        <w:rPr>
+          <w:sz w:val="28"/>
+          <w:szCs w:val="28"/>
+        </w:rPr>
+        <w:t xml:space="preserve">, </w:t>
+      </w:r>
+      <w:r>
+        <w:rPr>
+          <w:b/>
+          <w:bCs/>
+          <w:sz w:val="28"/>
+          <w:szCs w:val="28"/>
+        </w:rPr>
+        <w:t>Immunological Data</w:t>
+      </w:r>
+      <w:r>
+        <w:rPr>
+          <w:sz w:val="28"/>
+          <w:szCs w:val="28"/>
+        </w:rPr>
+        <w:t xml:space="preserve"> (</w:t>
+      </w:r>
+      <w:r>
+        <w:rPr>
+          <w:sz w:val="28"/>
+          <w:szCs w:val="28"/>
+        </w:rPr>
+        <w:t>cmv_status</w:t>
+      </w:r>
+      <w:r>
+        <w:rPr>
+          <w:sz w:val="28"/>
+          <w:szCs w:val="28"/>
+        </w:rPr>
+        <w:t xml:space="preserve">, </w:t>
+      </w:r>
+      <w:r>
+        <w:rPr>
+          <w:sz w:val="28"/>
+          <w:szCs w:val="28"/>
+        </w:rPr>
+        <w:t>ebv_status</w:t>
+      </w:r>
+      <w:r>
+        <w:rPr>
+          <w:sz w:val="28"/>
+          <w:szCs w:val="28"/>
+        </w:rPr>
+        <w:t xml:space="preserve">, </w:t>
+      </w:r>
+      <w:r>
+        <w:rPr>
+          <w:sz w:val="28"/>
+          <w:szCs w:val="28"/>
+        </w:rPr>
+        <w:t>assay</w:t>
+      </w:r>
+      <w:r>
+        <w:rPr>
+          <w:sz w:val="28"/>
+          <w:szCs w:val="28"/>
+        </w:rPr>
+        <w:t xml:space="preserve">, </w:t>
+      </w:r>
+      <w:r>
+        <w:rPr>
+          <w:sz w:val="28"/>
+          <w:szCs w:val="28"/>
+        </w:rPr>
+        <w:t>geo_mean</w:t>
+      </w:r>
+      <w:r>
+        <w:rPr>
+          <w:sz w:val="28"/>
+          <w:szCs w:val="28"/>
+        </w:rPr>
+        <w:t xml:space="preserve">, </w:t>
+      </w:r>
+      <w:r>
+        <w:rPr>
+          <w:sz w:val="28"/>
+          <w:szCs w:val="28"/>
+        </w:rPr>
+        <w:t>d_geo_mean</w:t>
+      </w:r>
+      <w:r>
+        <w:rPr>
+          <w:sz w:val="28"/>
+          <w:szCs w:val="28"/>
+        </w:rPr>
+        <w:t>)</w:t>
+      </w:r>
+      <w:r>
+        <w:rPr>
+          <w:sz w:val="28"/>
+          <w:szCs w:val="28"/>
+        </w:rPr>
+        <w:t>,</w:t>
+      </w:r>
+      <w:r>
+        <w:rPr>
+          <w:sz w:val="28"/>
+          <w:szCs w:val="28"/>
+        </w:rPr>
+        <w:t xml:space="preserve"> </w:t>
+      </w:r>
+      <w:r>
+        <w:rPr>
+          <w:b/>
+          <w:bCs/>
+          <w:sz w:val="28"/>
+          <w:szCs w:val="28"/>
+        </w:rPr>
+        <w:t>Vaccine Response Data</w:t>
+      </w:r>
+      <w:r>
+        <w:rPr>
+          <w:b/>
+          <w:bCs/>
+          <w:sz w:val="28"/>
+          <w:szCs w:val="28"/>
+        </w:rPr>
+        <w:t xml:space="preserve"> </w:t>
+      </w:r>
+      <w:r>
+        <w:rPr>
+          <w:sz w:val="28"/>
+          <w:szCs w:val="28"/>
+        </w:rPr>
+        <w:t>(</w:t>
+      </w:r>
+      <w:r>
+        <w:rPr>
+          <w:sz w:val="28"/>
+          <w:szCs w:val="28"/>
+        </w:rPr>
+        <w:t>vaccine_response</w:t>
+      </w:r>
+      <w:r>
+        <w:rPr>
+          <w:sz w:val="28"/>
+          <w:szCs w:val="28"/>
+        </w:rPr>
+        <w:t xml:space="preserve">, </w:t>
+      </w:r>
+      <w:r>
+        <w:rPr>
+          <w:sz w:val="28"/>
+          <w:szCs w:val="28"/>
+        </w:rPr>
+        <w:t>statin_use</w:t>
+      </w:r>
+      <w:r>
+        <w:rPr>
+          <w:sz w:val="28"/>
+          <w:szCs w:val="28"/>
+        </w:rPr>
+        <w:t xml:space="preserve">, </w:t>
+      </w:r>
+      <w:r>
+        <w:rPr>
+          <w:sz w:val="28"/>
+          <w:szCs w:val="28"/>
+        </w:rPr>
+        <w:t>flu_vaccination_history</w:t>
+      </w:r>
+      <w:r>
+        <w:rPr>
+          <w:sz w:val="28"/>
+          <w:szCs w:val="28"/>
+        </w:rPr>
+        <w:t>)</w:t>
+      </w:r>
+      <w:r>
+        <w:rPr>
+          <w:sz w:val="28"/>
+          <w:szCs w:val="28"/>
+        </w:rPr>
+        <w:t>,</w:t>
+      </w:r>
+      <w:r>
+        <w:rPr>
+          <w:sz w:val="28"/>
+          <w:szCs w:val="28"/>
+        </w:rPr>
+        <w:t xml:space="preserve"> </w:t>
+      </w:r>
+      <w:r>
+        <w:rPr>
+          <w:b/>
+          <w:bCs/>
+          <w:sz w:val="28"/>
+          <w:szCs w:val="28"/>
+        </w:rPr>
+        <w:t>Time-based Data</w:t>
+      </w:r>
+      <w:r>
+        <w:rPr>
+          <w:b/>
+          <w:bCs/>
+          <w:sz w:val="28"/>
+          <w:szCs w:val="28"/>
+        </w:rPr>
+        <w:t xml:space="preserve"> </w:t>
+      </w:r>
+      <w:r>
+        <w:rPr>
+          <w:sz w:val="28"/>
+          <w:szCs w:val="28"/>
+        </w:rPr>
+        <w:t>(</w:t>
+      </w:r>
+      <w:r>
+        <w:rPr>
+          <w:sz w:val="28"/>
+          <w:szCs w:val="28"/>
+        </w:rPr>
+        <w:t>visit_year</w:t>
+      </w:r>
+      <w:r>
+        <w:rPr>
+          <w:sz w:val="28"/>
+          <w:szCs w:val="28"/>
+        </w:rPr>
+        <w:t xml:space="preserve">, </w:t>
+      </w:r>
+      <w:r>
+        <w:rPr>
+          <w:sz w:val="28"/>
+          <w:szCs w:val="28"/>
+        </w:rPr>
+        <w:t>visit_day</w:t>
+      </w:r>
+      <w:r>
+        <w:rPr>
+          <w:sz w:val="28"/>
+          <w:szCs w:val="28"/>
+        </w:rPr>
+        <w:t xml:space="preserve">, </w:t>
+      </w:r>
+      <w:r>
+        <w:rPr>
+          <w:sz w:val="28"/>
+          <w:szCs w:val="28"/>
+        </w:rPr>
+        <w:t>visit_type_hai</w:t>
+      </w:r>
+      <w:r>
+        <w:rPr>
+          <w:sz w:val="28"/>
+          <w:szCs w:val="28"/>
+        </w:rPr>
+        <w:t xml:space="preserve">, </w:t>
+      </w:r>
+      <w:r>
+        <w:rPr>
+          <w:sz w:val="28"/>
+          <w:szCs w:val="28"/>
+        </w:rPr>
+        <w:t>mesurment_id</w:t>
+      </w:r>
+      <w:r>
+        <w:rPr>
+          <w:sz w:val="28"/>
+          <w:szCs w:val="28"/>
+        </w:rPr>
+        <w:t>).</w:t>
       </w:r>
     </w:p>
     <w:p>
@@ -867,11 +1356,13 @@
         <w:spacing w:before="163"/>
         <w:ind w:left="698" w:hanging="217"/>
         <w:rPr>
-          <w:sz w:val="25"/>
-        </w:rPr>
-      </w:pPr>
-      <w:r>
-        <w:rPr>
+          <w:color w:val="FFFFFF" w:themeColor="background1"/>
+          <w:sz w:val="25"/>
+        </w:rPr>
+      </w:pPr>
+      <w:r>
+        <w:rPr>
+          <w:color w:val="FFFFFF" w:themeColor="background1"/>
           <w:spacing w:val="-4"/>
           <w:sz w:val="25"/>
         </w:rPr>
@@ -879,6 +1370,7 @@
       </w:r>
       <w:r>
         <w:rPr>
+          <w:color w:val="FFFFFF" w:themeColor="background1"/>
           <w:spacing w:val="-6"/>
           <w:sz w:val="25"/>
         </w:rPr>
@@ -886,6 +1378,7 @@
       </w:r>
       <w:r>
         <w:rPr>
+          <w:color w:val="FFFFFF" w:themeColor="background1"/>
           <w:spacing w:val="-4"/>
           <w:sz w:val="25"/>
         </w:rPr>
@@ -893,14 +1386,15 @@
       </w:r>
       <w:r>
         <w:rPr>
+          <w:color w:val="FFFFFF" w:themeColor="background1"/>
           <w:spacing w:val="-6"/>
           <w:sz w:val="25"/>
         </w:rPr>
         <w:t xml:space="preserve"> </w:t>
       </w:r>
-      <w:proofErr w:type="gramStart"/>
-      <w:r>
-        <w:rPr>
+      <w:r>
+        <w:rPr>
+          <w:color w:val="FFFFFF" w:themeColor="background1"/>
           <w:spacing w:val="-4"/>
           <w:sz w:val="25"/>
         </w:rPr>
@@ -908,23 +1402,23 @@
       </w:r>
       <w:r>
         <w:rPr>
+          <w:color w:val="FFFFFF" w:themeColor="background1"/>
           <w:spacing w:val="-5"/>
           <w:sz w:val="25"/>
         </w:rPr>
         <w:t xml:space="preserve"> </w:t>
       </w:r>
-      <w:proofErr w:type="spellStart"/>
-      <w:r>
-        <w:rPr>
+      <w:r>
+        <w:rPr>
+          <w:color w:val="FFFFFF" w:themeColor="background1"/>
           <w:spacing w:val="-4"/>
           <w:sz w:val="25"/>
         </w:rPr>
         <w:t>the</w:t>
       </w:r>
-      <w:proofErr w:type="spellEnd"/>
-      <w:proofErr w:type="gramEnd"/>
-      <w:r>
-        <w:rPr>
+      <w:r>
+        <w:rPr>
+          <w:color w:val="FFFFFF" w:themeColor="background1"/>
           <w:spacing w:val="-6"/>
           <w:sz w:val="25"/>
         </w:rPr>
@@ -932,6 +1426,7 @@
       </w:r>
       <w:r>
         <w:rPr>
+          <w:color w:val="FFFFFF" w:themeColor="background1"/>
           <w:spacing w:val="-4"/>
           <w:sz w:val="25"/>
         </w:rPr>
@@ -939,6 +1434,7 @@
       </w:r>
       <w:r>
         <w:rPr>
+          <w:color w:val="FFFFFF" w:themeColor="background1"/>
           <w:spacing w:val="-5"/>
           <w:sz w:val="25"/>
         </w:rPr>
@@ -946,6 +1442,7 @@
       </w:r>
       <w:r>
         <w:rPr>
+          <w:color w:val="FFFFFF" w:themeColor="background1"/>
           <w:spacing w:val="-4"/>
           <w:sz w:val="25"/>
         </w:rPr>
@@ -957,93 +1454,111 @@
         <w:pStyle w:val="BodyText"/>
         <w:spacing w:before="162"/>
         <w:ind w:left="492"/>
-      </w:pPr>
-      <w:r>
-        <w:rPr>
+        <w:rPr>
+          <w:color w:val="FFFFFF" w:themeColor="background1"/>
+        </w:rPr>
+      </w:pPr>
+      <w:r>
+        <w:rPr>
+          <w:color w:val="FFFFFF" w:themeColor="background1"/>
           <w:spacing w:val="-2"/>
         </w:rPr>
         <w:t>Please</w:t>
       </w:r>
       <w:r>
         <w:rPr>
+          <w:color w:val="FFFFFF" w:themeColor="background1"/>
           <w:spacing w:val="-12"/>
         </w:rPr>
         <w:t xml:space="preserve"> </w:t>
       </w:r>
       <w:r>
         <w:rPr>
+          <w:color w:val="FFFFFF" w:themeColor="background1"/>
           <w:spacing w:val="-2"/>
         </w:rPr>
         <w:t>add</w:t>
       </w:r>
       <w:r>
         <w:rPr>
+          <w:color w:val="FFFFFF" w:themeColor="background1"/>
           <w:spacing w:val="-11"/>
         </w:rPr>
         <w:t xml:space="preserve"> </w:t>
       </w:r>
       <w:r>
         <w:rPr>
+          <w:color w:val="FFFFFF" w:themeColor="background1"/>
           <w:spacing w:val="-2"/>
         </w:rPr>
         <w:t>a</w:t>
       </w:r>
       <w:r>
         <w:rPr>
+          <w:color w:val="FFFFFF" w:themeColor="background1"/>
           <w:spacing w:val="-11"/>
         </w:rPr>
         <w:t xml:space="preserve"> </w:t>
       </w:r>
       <w:r>
         <w:rPr>
+          <w:color w:val="FFFFFF" w:themeColor="background1"/>
           <w:spacing w:val="-2"/>
         </w:rPr>
         <w:t>graphical</w:t>
       </w:r>
       <w:r>
         <w:rPr>
+          <w:color w:val="FFFFFF" w:themeColor="background1"/>
           <w:spacing w:val="-12"/>
         </w:rPr>
         <w:t xml:space="preserve"> </w:t>
       </w:r>
       <w:r>
         <w:rPr>
+          <w:color w:val="FFFFFF" w:themeColor="background1"/>
           <w:spacing w:val="-2"/>
         </w:rPr>
         <w:t>abstract</w:t>
       </w:r>
       <w:r>
         <w:rPr>
+          <w:color w:val="FFFFFF" w:themeColor="background1"/>
           <w:spacing w:val="-11"/>
         </w:rPr>
         <w:t xml:space="preserve"> </w:t>
       </w:r>
       <w:r>
         <w:rPr>
+          <w:color w:val="FFFFFF" w:themeColor="background1"/>
           <w:spacing w:val="-2"/>
         </w:rPr>
         <w:t>of</w:t>
       </w:r>
       <w:r>
         <w:rPr>
+          <w:color w:val="FFFFFF" w:themeColor="background1"/>
           <w:spacing w:val="-11"/>
         </w:rPr>
         <w:t xml:space="preserve"> </w:t>
       </w:r>
       <w:r>
         <w:rPr>
+          <w:color w:val="FFFFFF" w:themeColor="background1"/>
           <w:spacing w:val="-2"/>
         </w:rPr>
         <w:t>your</w:t>
       </w:r>
       <w:r>
         <w:rPr>
+          <w:color w:val="FFFFFF" w:themeColor="background1"/>
           <w:spacing w:val="-11"/>
         </w:rPr>
         <w:t xml:space="preserve"> </w:t>
       </w:r>
       <w:r>
         <w:rPr>
+          <w:color w:val="FFFFFF" w:themeColor="background1"/>
           <w:spacing w:val="-2"/>
         </w:rPr>
         <w:t>work.</w:t>
@@ -1138,14 +1653,12 @@
             <w:spacing w:line="275" w:lineRule="exact"/>
           </w:pPr>
           <w:hyperlink w:anchor="_bookmark1" w:history="1">
-            <w:proofErr w:type="gramStart"/>
             <w:r>
               <w:rPr>
                 <w:color w:val="FF0000"/>
               </w:rPr>
               <w:t>What'!</w:t>
             </w:r>
-            <w:proofErr w:type="gramEnd"/>
             <w:r>
               <w:rPr>
                 <w:color w:val="FF0000"/>
@@ -1477,7 +1990,6 @@
             </w:rPr>
             <w:t xml:space="preserve"> </w:t>
           </w:r>
-          <w:proofErr w:type="gramStart"/>
           <w:r>
             <w:t>.</w:t>
           </w:r>
@@ -1511,7 +2023,6 @@
             </w:rPr>
             <w:t>.</w:t>
           </w:r>
-          <w:proofErr w:type="gramEnd"/>
           <w:r>
             <w:rPr>
               <w:sz w:val="22"/>
@@ -2219,7 +2730,6 @@
             </w:rPr>
             <w:t xml:space="preserve"> </w:t>
           </w:r>
-          <w:proofErr w:type="gramStart"/>
           <w:r>
             <w:t>.</w:t>
           </w:r>
@@ -2250,7 +2760,6 @@
           <w:r>
             <w:t>.</w:t>
           </w:r>
-          <w:proofErr w:type="gramEnd"/>
           <w:r>
             <w:rPr>
               <w:spacing w:val="40"/>
@@ -2730,7 +3239,6 @@
             </w:rPr>
             <w:t xml:space="preserve"> </w:t>
           </w:r>
-          <w:proofErr w:type="gramStart"/>
           <w:r>
             <w:t>.</w:t>
           </w:r>
@@ -2761,7 +3269,6 @@
           <w:r>
             <w:t>.</w:t>
           </w:r>
-          <w:proofErr w:type="gramEnd"/>
           <w:r>
             <w:rPr>
               <w:spacing w:val="34"/>
@@ -3153,7 +3660,6 @@
             </w:rPr>
             <w:t xml:space="preserve"> </w:t>
           </w:r>
-          <w:proofErr w:type="gramStart"/>
           <w:r>
             <w:t>.</w:t>
           </w:r>
@@ -3184,7 +3690,6 @@
           <w:r>
             <w:t>.</w:t>
           </w:r>
-          <w:proofErr w:type="gramEnd"/>
           <w:r>
             <w:rPr>
               <w:spacing w:val="44"/>
@@ -3561,7 +4066,6 @@
             </w:rPr>
             <w:t xml:space="preserve"> </w:t>
           </w:r>
-          <w:proofErr w:type="gramStart"/>
           <w:r>
             <w:t>.</w:t>
           </w:r>
@@ -3595,7 +4099,6 @@
             </w:rPr>
             <w:t>.</w:t>
           </w:r>
-          <w:proofErr w:type="gramEnd"/>
           <w:r>
             <w:rPr>
               <w:sz w:val="22"/>
@@ -3949,7 +4452,6 @@
             </w:rPr>
             <w:t xml:space="preserve"> </w:t>
           </w:r>
-          <w:proofErr w:type="gramStart"/>
           <w:r>
             <w:t>.</w:t>
           </w:r>
@@ -3980,7 +4482,6 @@
           <w:r>
             <w:t>.</w:t>
           </w:r>
-          <w:proofErr w:type="gramEnd"/>
           <w:r>
             <w:rPr>
               <w:spacing w:val="44"/>
@@ -4343,7 +4844,6 @@
             </w:rPr>
             <w:t xml:space="preserve"> </w:t>
           </w:r>
-          <w:proofErr w:type="gramStart"/>
           <w:r>
             <w:t>.</w:t>
           </w:r>
@@ -4377,7 +4877,6 @@
             </w:rPr>
             <w:t>.</w:t>
           </w:r>
-          <w:proofErr w:type="gramEnd"/>
           <w:r>
             <w:rPr>
               <w:sz w:val="22"/>
@@ -4717,7 +5216,6 @@
             </w:rPr>
             <w:t xml:space="preserve"> </w:t>
           </w:r>
-          <w:proofErr w:type="gramStart"/>
           <w:r>
             <w:t>.</w:t>
           </w:r>
@@ -4751,7 +5249,6 @@
             </w:rPr>
             <w:t>.</w:t>
           </w:r>
-          <w:proofErr w:type="gramEnd"/>
           <w:r>
             <w:rPr>
               <w:sz w:val="22"/>
@@ -5534,7 +6031,6 @@
             </w:rPr>
             <w:t xml:space="preserve"> </w:t>
           </w:r>
-          <w:proofErr w:type="gramStart"/>
           <w:r>
             <w:t>.</w:t>
           </w:r>
@@ -5568,7 +6064,6 @@
             </w:rPr>
             <w:t>.</w:t>
           </w:r>
-          <w:proofErr w:type="gramEnd"/>
           <w:r>
             <w:rPr>
               <w:sz w:val="22"/>
@@ -6640,7 +7135,6 @@
           </w:rPr>
           <w:t xml:space="preserve"> </w:t>
         </w:r>
-        <w:proofErr w:type="gramStart"/>
         <w:r>
           <w:rPr>
             <w:color w:val="FF0000"/>
@@ -6665,7 +7159,6 @@
           </w:rPr>
           <w:t>results</w:t>
         </w:r>
-        <w:proofErr w:type="gramEnd"/>
         <w:r>
           <w:rPr>
             <w:color w:val="FF0000"/>
@@ -7018,7 +7511,6 @@
         </w:rPr>
         <w:t xml:space="preserve"> </w:t>
       </w:r>
-      <w:proofErr w:type="gramStart"/>
       <w:r>
         <w:t>.</w:t>
       </w:r>
@@ -7052,7 +7544,6 @@
         </w:rPr>
         <w:t>.</w:t>
       </w:r>
-      <w:proofErr w:type="gramEnd"/>
       <w:r>
         <w:rPr>
           <w:sz w:val="22"/>
@@ -7189,7 +7680,6 @@
           </w:rPr>
           <w:t xml:space="preserve"> </w:t>
         </w:r>
-        <w:proofErr w:type="spellStart"/>
         <w:r>
           <w:rPr>
             <w:color w:val="FF0000"/>
@@ -7198,7 +7688,6 @@
           </w:rPr>
           <w:t>AQlgorithm</w:t>
         </w:r>
-        <w:proofErr w:type="spellEnd"/>
       </w:hyperlink>
       <w:r>
         <w:rPr>
@@ -8184,27 +8673,14 @@
         </w:rPr>
         <w:t xml:space="preserve"> </w:t>
       </w:r>
-      <w:proofErr w:type="gramStart"/>
       <w:r>
         <w:rPr>
           <w:spacing w:val="-4"/>
         </w:rPr>
-        <w:t>par</w:t>
-      </w:r>
-      <w:proofErr w:type="gramEnd"/>
-      <w:r>
-        <w:rPr>
-          <w:spacing w:val="-4"/>
-        </w:rPr>
-        <w:t xml:space="preserve">- </w:t>
-      </w:r>
-      <w:proofErr w:type="spellStart"/>
-      <w:r>
-        <w:t>ticular</w:t>
-      </w:r>
-      <w:proofErr w:type="spellEnd"/>
-      <w:r>
-        <w:t xml:space="preserve"> models.</w:t>
+        <w:t xml:space="preserve">par- </w:t>
+      </w:r>
+      <w:r>
+        <w:t>ticular models.</w:t>
       </w:r>
     </w:p>
     <w:p>
@@ -8424,16 +8900,8 @@
         <w:rPr>
           <w:w w:val="90"/>
         </w:rPr>
-        <w:t xml:space="preserve">The second contribution of this report consists of building an intuitive, easy-to-use and </w:t>
-      </w:r>
-      <w:proofErr w:type="gramStart"/>
-      <w:r>
-        <w:rPr>
-          <w:w w:val="90"/>
-        </w:rPr>
-        <w:t>user friendly</w:t>
-      </w:r>
-      <w:proofErr w:type="gramEnd"/>
+        <w:t>The second contribution of this report consists of building an intuitive, easy-to-use and user friendly</w:t>
+      </w:r>
       <w:r>
         <w:rPr>
           <w:spacing w:val="80"/>
@@ -8802,7 +9270,6 @@
         </w:rPr>
         <w:t xml:space="preserve"> </w:t>
       </w:r>
-      <w:proofErr w:type="spellStart"/>
       <w:r>
         <w:rPr>
           <w:rFonts w:ascii="Georgia"/>
@@ -8812,7 +9279,6 @@
         </w:rPr>
         <w:t>xyz</w:t>
       </w:r>
-      <w:proofErr w:type="spellEnd"/>
       <w:r>
         <w:rPr>
           <w:rFonts w:ascii="Georgia"/>
@@ -9131,7 +9597,7 @@
       <w:pPr>
         <w:spacing w:line="338" w:lineRule="auto"/>
         <w:sectPr>
-          <w:footerReference w:type="default" r:id="rId8"/>
+          <w:footerReference w:type="default" r:id="rId9"/>
           <w:pgSz w:w="11910" w:h="16840"/>
           <w:pgMar w:top="1920" w:right="980" w:bottom="1280" w:left="980" w:header="0" w:footer="1097" w:gutter="0"/>
           <w:cols w:space="720"/>
@@ -9147,20 +9613,12 @@
         <w:spacing w:before="42"/>
         <w:ind w:left="153"/>
       </w:pPr>
-      <w:proofErr w:type="gramStart"/>
       <w:r>
         <w:rPr>
           <w:spacing w:val="-5"/>
         </w:rPr>
         <w:lastRenderedPageBreak/>
-        <w:t>Team's</w:t>
-      </w:r>
-      <w:proofErr w:type="gramEnd"/>
-      <w:r>
-        <w:rPr>
-          <w:spacing w:val="-5"/>
-        </w:rPr>
-        <w:t xml:space="preserve"> </w:t>
+        <w:t xml:space="preserve">Team's </w:t>
       </w:r>
       <w:r>
         <w:rPr>
@@ -9948,7 +10406,7 @@
           <w:sz w:val="20"/>
         </w:rPr>
         <w:sectPr>
-          <w:footerReference w:type="default" r:id="rId9"/>
+          <w:footerReference w:type="default" r:id="rId10"/>
           <w:pgSz w:w="11910" w:h="16840"/>
           <w:pgMar w:top="860" w:right="980" w:bottom="1280" w:left="980" w:header="0" w:footer="1097" w:gutter="0"/>
           <w:cols w:space="720"/>
@@ -10407,7 +10865,6 @@
         </w:rPr>
         <w:t xml:space="preserve"> </w:t>
       </w:r>
-      <w:proofErr w:type="gramStart"/>
       <w:r>
         <w:rPr>
           <w:spacing w:val="-2"/>
@@ -10426,7 +10883,6 @@
         </w:rPr>
         <w:t>(some)</w:t>
       </w:r>
-      <w:proofErr w:type="gramEnd"/>
       <w:r>
         <w:rPr>
           <w:spacing w:val="-10"/>
@@ -10745,7 +11201,7 @@
     <w:p>
       <w:pPr>
         <w:sectPr>
-          <w:footerReference w:type="default" r:id="rId10"/>
+          <w:footerReference w:type="default" r:id="rId11"/>
           <w:pgSz w:w="11910" w:h="16840"/>
           <w:pgMar w:top="1920" w:right="980" w:bottom="1060" w:left="980" w:header="0" w:footer="876" w:gutter="0"/>
           <w:pgNumType w:start="3"/>
@@ -10966,14 +11422,12 @@
         </w:rPr>
         <w:t xml:space="preserve"> </w:t>
       </w:r>
-      <w:proofErr w:type="spellStart"/>
       <w:r>
         <w:rPr>
           <w:spacing w:val="-4"/>
         </w:rPr>
         <w:t>utilised</w:t>
       </w:r>
-      <w:proofErr w:type="spellEnd"/>
       <w:r>
         <w:rPr>
           <w:spacing w:val="-7"/>
@@ -11004,7 +11458,6 @@
         </w:rPr>
         <w:t xml:space="preserve"> </w:t>
       </w:r>
-      <w:proofErr w:type="gramStart"/>
       <w:r>
         <w:rPr>
           <w:spacing w:val="-4"/>
@@ -11035,7 +11488,6 @@
         </w:rPr>
         <w:t>to</w:t>
       </w:r>
-      <w:proofErr w:type="gramEnd"/>
       <w:r>
         <w:rPr>
           <w:spacing w:val="-7"/>
@@ -12087,19 +12539,11 @@
         </w:rPr>
         <w:t xml:space="preserve"> </w:t>
       </w:r>
-      <w:proofErr w:type="spellStart"/>
-      <w:r>
-        <w:rPr>
-          <w:spacing w:val="-2"/>
-        </w:rPr>
-        <w:t>psuedocode</w:t>
-      </w:r>
-      <w:proofErr w:type="spellEnd"/>
-      <w:r>
-        <w:rPr>
-          <w:spacing w:val="-2"/>
-        </w:rPr>
-        <w:t xml:space="preserve"> </w:t>
+      <w:r>
+        <w:rPr>
+          <w:spacing w:val="-2"/>
+        </w:rPr>
+        <w:t xml:space="preserve">psuedocode </w:t>
       </w:r>
       <w:r>
         <w:t>description</w:t>
@@ -12353,7 +12797,6 @@
         </w:rPr>
         <w:t xml:space="preserve"> </w:t>
       </w:r>
-      <w:proofErr w:type="gramStart"/>
       <w:r>
         <w:t>all</w:t>
       </w:r>
@@ -12366,7 +12809,6 @@
       <w:r>
         <w:t>of</w:t>
       </w:r>
-      <w:proofErr w:type="gramEnd"/>
       <w:r>
         <w:rPr>
           <w:spacing w:val="-12"/>
@@ -12947,14 +13389,12 @@
         </w:rPr>
         <w:t xml:space="preserve"> </w:t>
       </w:r>
-      <w:proofErr w:type="spellStart"/>
       <w:r>
         <w:rPr>
           <w:spacing w:val="-6"/>
         </w:rPr>
         <w:t>fiow</w:t>
       </w:r>
-      <w:proofErr w:type="spellEnd"/>
       <w:r>
         <w:rPr>
           <w:spacing w:val="-8"/>
@@ -13301,16 +13741,8 @@
         <w:rPr>
           <w:spacing w:val="-6"/>
         </w:rPr>
-        <w:t xml:space="preserve">about </w:t>
-      </w:r>
-      <w:proofErr w:type="gramStart"/>
-      <w:r>
-        <w:rPr>
-          <w:spacing w:val="-6"/>
-        </w:rPr>
-        <w:t>app's</w:t>
-      </w:r>
-      <w:proofErr w:type="gramEnd"/>
+        <w:t>about app's</w:t>
+      </w:r>
       <w:r>
         <w:rPr>
           <w:spacing w:val="-7"/>
@@ -13469,19 +13901,11 @@
         </w:rPr>
         <w:t xml:space="preserve"> </w:t>
       </w:r>
-      <w:proofErr w:type="spellStart"/>
       <w:r>
         <w:rPr>
           <w:spacing w:val="-8"/>
         </w:rPr>
-        <w:t>unitTestings</w:t>
-      </w:r>
-      <w:proofErr w:type="spellEnd"/>
-      <w:r>
-        <w:rPr>
-          <w:spacing w:val="-8"/>
-        </w:rPr>
-        <w:t>,</w:t>
+        <w:t>unitTestings,</w:t>
       </w:r>
       <w:r>
         <w:rPr>
@@ -13574,15 +13998,7 @@
         <w:t xml:space="preserve">Explain the experimental methodology and the numerical results obtained with your approach and the </w:t>
       </w:r>
       <w:r>
-        <w:t xml:space="preserve">state of art </w:t>
-      </w:r>
-      <w:proofErr w:type="spellStart"/>
-      <w:r>
-        <w:t>approache</w:t>
-      </w:r>
-      <w:proofErr w:type="spellEnd"/>
-      <w:r>
-        <w:t>(s).</w:t>
+        <w:t>state of art approache(s).</w:t>
       </w:r>
     </w:p>
     <w:p>
@@ -13595,16 +14011,8 @@
         <w:rPr>
           <w:spacing w:val="-6"/>
         </w:rPr>
-        <w:t xml:space="preserve">Try to </w:t>
-      </w:r>
-      <w:proofErr w:type="gramStart"/>
-      <w:r>
-        <w:rPr>
-          <w:spacing w:val="-6"/>
-        </w:rPr>
-        <w:t>perform</w:t>
-      </w:r>
-      <w:proofErr w:type="gramEnd"/>
+        <w:t>Try to perform</w:t>
+      </w:r>
       <w:r>
         <w:rPr>
           <w:spacing w:val="-5"/>
@@ -13648,20 +14056,12 @@
         <w:spacing w:before="42"/>
         <w:ind w:left="153"/>
       </w:pPr>
-      <w:proofErr w:type="gramStart"/>
       <w:r>
         <w:rPr>
           <w:spacing w:val="-5"/>
         </w:rPr>
         <w:lastRenderedPageBreak/>
-        <w:t>Team's</w:t>
-      </w:r>
-      <w:proofErr w:type="gramEnd"/>
-      <w:r>
-        <w:rPr>
-          <w:spacing w:val="-5"/>
-        </w:rPr>
-        <w:t xml:space="preserve"> </w:t>
+        <w:t xml:space="preserve">Team's </w:t>
       </w:r>
       <w:r>
         <w:rPr>
@@ -13908,7 +14308,6 @@
         </w:rPr>
         <w:t xml:space="preserve"> </w:t>
       </w:r>
-      <w:proofErr w:type="gramStart"/>
       <w:r>
         <w:rPr>
           <w:spacing w:val="-2"/>
@@ -13916,7 +14315,6 @@
         </w:rPr>
         <w:t>criteria</w:t>
       </w:r>
-      <w:proofErr w:type="gramEnd"/>
       <w:r>
         <w:rPr>
           <w:spacing w:val="-12"/>
@@ -14071,7 +14469,6 @@
         </w:rPr>
         <w:t xml:space="preserve"> </w:t>
       </w:r>
-      <w:proofErr w:type="gramStart"/>
       <w:r>
         <w:rPr>
           <w:spacing w:val="-4"/>
@@ -14093,7 +14490,6 @@
         </w:rPr>
         <w:t>does</w:t>
       </w:r>
-      <w:proofErr w:type="gramEnd"/>
       <w:r>
         <w:rPr>
           <w:spacing w:val="-5"/>
@@ -14285,21 +14681,12 @@
         </w:rPr>
         <w:t xml:space="preserve"> </w:t>
       </w:r>
-      <w:proofErr w:type="gramStart"/>
-      <w:r>
-        <w:rPr>
-          <w:spacing w:val="-2"/>
-          <w:sz w:val="25"/>
-        </w:rPr>
-        <w:t>variables'</w:t>
-      </w:r>
-      <w:proofErr w:type="gramEnd"/>
-      <w:r>
-        <w:rPr>
-          <w:spacing w:val="-2"/>
-          <w:sz w:val="25"/>
-        </w:rPr>
-        <w:t>!</w:t>
+      <w:r>
+        <w:rPr>
+          <w:spacing w:val="-2"/>
+          <w:sz w:val="25"/>
+        </w:rPr>
+        <w:t>variables'!</w:t>
       </w:r>
     </w:p>
     <w:p>
@@ -14658,7 +15045,6 @@
         </w:rPr>
         <w:t xml:space="preserve"> </w:t>
       </w:r>
-      <w:proofErr w:type="gramStart"/>
       <w:r>
         <w:rPr>
           <w:spacing w:val="-4"/>
@@ -14680,7 +15066,6 @@
         </w:rPr>
         <w:t>you</w:t>
       </w:r>
-      <w:proofErr w:type="gramEnd"/>
       <w:r>
         <w:rPr>
           <w:spacing w:val="-12"/>
@@ -14758,21 +15143,12 @@
         </w:rPr>
         <w:t xml:space="preserve"> </w:t>
       </w:r>
-      <w:proofErr w:type="gramStart"/>
       <w:r>
         <w:rPr>
           <w:spacing w:val="-4"/>
           <w:sz w:val="25"/>
         </w:rPr>
-        <w:t>to</w:t>
-      </w:r>
-      <w:proofErr w:type="gramEnd"/>
-      <w:r>
-        <w:rPr>
-          <w:spacing w:val="-4"/>
-          <w:sz w:val="25"/>
-        </w:rPr>
-        <w:t xml:space="preserve"> </w:t>
+        <w:t xml:space="preserve">to </w:t>
       </w:r>
       <w:r>
         <w:rPr>
@@ -15135,14 +15511,12 @@
         </w:rPr>
         <w:t xml:space="preserve"> </w:t>
       </w:r>
-      <w:proofErr w:type="gramStart"/>
       <w:r>
         <w:rPr>
           <w:spacing w:val="-2"/>
         </w:rPr>
         <w:t>presentation</w:t>
       </w:r>
-      <w:proofErr w:type="gramEnd"/>
       <w:r>
         <w:rPr>
           <w:spacing w:val="-13"/>
@@ -16106,7 +16480,7 @@
           <w:sz w:val="20"/>
         </w:rPr>
         <w:sectPr>
-          <w:footerReference w:type="default" r:id="rId11"/>
+          <w:footerReference w:type="default" r:id="rId12"/>
           <w:pgSz w:w="11910" w:h="16840"/>
           <w:pgMar w:top="860" w:right="980" w:bottom="1060" w:left="980" w:header="0" w:footer="876" w:gutter="0"/>
           <w:cols w:space="720"/>
@@ -16269,14 +16643,12 @@
         </w:rPr>
         <w:t xml:space="preserve"> </w:t>
       </w:r>
-      <w:proofErr w:type="spellStart"/>
       <w:r>
         <w:rPr>
           <w:spacing w:val="-8"/>
         </w:rPr>
         <w:t>emphasise</w:t>
       </w:r>
-      <w:proofErr w:type="spellEnd"/>
       <w:r>
         <w:rPr>
           <w:spacing w:val="-5"/>
@@ -16606,14 +16978,12 @@
         <w:ind w:left="492"/>
         <w:jc w:val="both"/>
       </w:pPr>
-      <w:proofErr w:type="spellStart"/>
       <w:r>
         <w:rPr>
           <w:spacing w:val="-6"/>
         </w:rPr>
         <w:t>Briefiy</w:t>
       </w:r>
-      <w:proofErr w:type="spellEnd"/>
       <w:r>
         <w:t xml:space="preserve"> </w:t>
       </w:r>
@@ -17064,7 +17434,7 @@
           <w:sz w:val="25"/>
         </w:rPr>
         <w:sectPr>
-          <w:footerReference w:type="default" r:id="rId12"/>
+          <w:footerReference w:type="default" r:id="rId13"/>
           <w:pgSz w:w="11910" w:h="16840"/>
           <w:pgMar w:top="1920" w:right="980" w:bottom="1060" w:left="980" w:header="0" w:footer="876" w:gutter="0"/>
           <w:pgNumType w:start="8"/>
@@ -19784,7 +20154,6 @@
                                   <w:sz w:val="13"/>
                                 </w:rPr>
                               </w:pPr>
-                              <w:proofErr w:type="gramStart"/>
                               <w:r>
                                 <w:rPr>
                                   <w:rFonts w:ascii="Arial"/>
@@ -19813,7 +20182,6 @@
                                 </w:rPr>
                                 <w:t>5</w:t>
                               </w:r>
-                              <w:proofErr w:type="gramEnd"/>
                               <w:r>
                                 <w:rPr>
                                   <w:rFonts w:ascii="Arial"/>
@@ -20329,7 +20697,6 @@
                             <w:sz w:val="13"/>
                           </w:rPr>
                         </w:pPr>
-                        <w:proofErr w:type="gramStart"/>
                         <w:r>
                           <w:rPr>
                             <w:rFonts w:ascii="Arial"/>
@@ -20358,7 +20725,6 @@
                           </w:rPr>
                           <w:t>5</w:t>
                         </w:r>
-                        <w:proofErr w:type="gramEnd"/>
                         <w:r>
                           <w:rPr>
                             <w:rFonts w:ascii="Arial"/>
@@ -20758,7 +21124,6 @@
         </w:rPr>
         <w:t xml:space="preserve"> </w:t>
       </w:r>
-      <w:proofErr w:type="gramStart"/>
       <w:r>
         <w:rPr>
           <w:spacing w:val="-6"/>
@@ -20777,7 +21142,6 @@
         </w:rPr>
         <w:t>results</w:t>
       </w:r>
-      <w:proofErr w:type="gramEnd"/>
       <w:r>
         <w:rPr>
           <w:spacing w:val="-9"/>
@@ -21049,20 +21413,12 @@
         <w:spacing w:before="42"/>
         <w:ind w:left="153"/>
       </w:pPr>
-      <w:proofErr w:type="gramStart"/>
       <w:r>
         <w:rPr>
           <w:spacing w:val="-5"/>
         </w:rPr>
         <w:lastRenderedPageBreak/>
-        <w:t>Team's</w:t>
-      </w:r>
-      <w:proofErr w:type="gramEnd"/>
-      <w:r>
-        <w:rPr>
-          <w:spacing w:val="-5"/>
-        </w:rPr>
-        <w:t xml:space="preserve"> </w:t>
+        <w:t xml:space="preserve">Team's </w:t>
       </w:r>
       <w:r>
         <w:rPr>
@@ -22074,7 +22430,6 @@
         </w:rPr>
         <w:t xml:space="preserve"> </w:t>
       </w:r>
-      <w:proofErr w:type="gramStart"/>
       <w:r>
         <w:rPr>
           <w:rFonts w:ascii="Georgia"/>
@@ -22092,17 +22447,7 @@
           <w:u w:val="single"/>
           <w:vertAlign w:val="superscript"/>
         </w:rPr>
-        <w:t>(</w:t>
-      </w:r>
-      <w:proofErr w:type="gramEnd"/>
-      <w:r>
-        <w:rPr>
-          <w:rFonts w:ascii="Tahoma"/>
-          <w:spacing w:val="-2"/>
-          <w:u w:val="single"/>
-          <w:vertAlign w:val="superscript"/>
-        </w:rPr>
-        <w:t>)</w:t>
+        <w:t>()</w:t>
       </w:r>
     </w:p>
     <w:p>
@@ -22401,21 +22746,12 @@
         </w:rPr>
         <w:t xml:space="preserve"> </w:t>
       </w:r>
-      <w:proofErr w:type="spellStart"/>
       <w:r>
         <w:rPr>
           <w:spacing w:val="-4"/>
           <w:sz w:val="25"/>
         </w:rPr>
-        <w:t>AQlgorithm</w:t>
-      </w:r>
-      <w:proofErr w:type="spellEnd"/>
-      <w:r>
-        <w:rPr>
-          <w:spacing w:val="-4"/>
-          <w:sz w:val="25"/>
-        </w:rPr>
-        <w:t xml:space="preserve"> </w:t>
+        <w:t xml:space="preserve">AQlgorithm </w:t>
       </w:r>
       <w:r>
         <w:rPr>
@@ -22659,7 +22995,6 @@
         </w:rPr>
         <w:t xml:space="preserve"> </w:t>
       </w:r>
-      <w:proofErr w:type="gramStart"/>
       <w:r>
         <w:rPr>
           <w:spacing w:val="-6"/>
@@ -22676,14 +23011,7 @@
         <w:rPr>
           <w:spacing w:val="-6"/>
         </w:rPr>
-        <w:t>individual</w:t>
-      </w:r>
-      <w:proofErr w:type="gramEnd"/>
-      <w:r>
-        <w:rPr>
-          <w:spacing w:val="-6"/>
-        </w:rPr>
-        <w:t xml:space="preserve">. </w:t>
+        <w:t xml:space="preserve">individual. </w:t>
       </w:r>
       <w:r>
         <w:rPr>
@@ -22700,21 +23028,8 @@
         </w:rPr>
         <w:t xml:space="preserve"> </w:t>
       </w:r>
-      <w:proofErr w:type="spellStart"/>
-      <w:r>
-        <w:t>i</w:t>
-      </w:r>
-      <w:proofErr w:type="spellEnd"/>
-      <w:r>
-        <w:t xml:space="preserve">=1 TO </w:t>
-      </w:r>
-      <w:proofErr w:type="spellStart"/>
-      <w:r>
-        <w:t>NoOfGenerations</w:t>
-      </w:r>
-      <w:proofErr w:type="spellEnd"/>
-      <w:r>
-        <w:t xml:space="preserve"> </w:t>
+      <w:r>
+        <w:t xml:space="preserve">i=1 TO NoOfGenerations </w:t>
       </w:r>
       <w:r>
         <w:rPr>
@@ -22774,7 +23089,6 @@
         </w:rPr>
         <w:t xml:space="preserve"> </w:t>
       </w:r>
-      <w:proofErr w:type="spellStart"/>
       <w:r>
         <w:rPr>
           <w:spacing w:val="-2"/>
@@ -22782,7 +23096,6 @@
         </w:rPr>
         <w:t>PopulationSize</w:t>
       </w:r>
-      <w:proofErr w:type="spellEnd"/>
       <w:r>
         <w:rPr>
           <w:spacing w:val="-9"/>
@@ -22830,27 +23143,11 @@
         </w:rPr>
         <w:t xml:space="preserve"> </w:t>
       </w:r>
-      <w:proofErr w:type="spellStart"/>
-      <w:proofErr w:type="gramStart"/>
-      <w:r>
-        <w:rPr>
-          <w:spacing w:val="-2"/>
-        </w:rPr>
-        <w:t>RandomlySelectParticleFromGrid</w:t>
-      </w:r>
-      <w:proofErr w:type="spellEnd"/>
-      <w:r>
-        <w:rPr>
-          <w:spacing w:val="-2"/>
-        </w:rPr>
-        <w:t>(</w:t>
-      </w:r>
-      <w:proofErr w:type="gramEnd"/>
-      <w:r>
-        <w:rPr>
-          <w:spacing w:val="-2"/>
-        </w:rPr>
-        <w:t>);</w:t>
+      <w:r>
+        <w:rPr>
+          <w:spacing w:val="-2"/>
+        </w:rPr>
+        <w:t>RandomlySelectParticleFromGrid();</w:t>
       </w:r>
     </w:p>
     <w:p>
@@ -22885,19 +23182,11 @@
         </w:rPr>
         <w:t xml:space="preserve"> </w:t>
       </w:r>
-      <w:proofErr w:type="spellStart"/>
       <w:r>
         <w:rPr>
           <w:spacing w:val="-8"/>
         </w:rPr>
-        <w:t>RandomlySelectParticleFromNeighbors</w:t>
-      </w:r>
-      <w:proofErr w:type="spellEnd"/>
-      <w:r>
-        <w:rPr>
-          <w:spacing w:val="-8"/>
-        </w:rPr>
-        <w:t xml:space="preserve">(p); </w:t>
+        <w:t xml:space="preserve">RandomlySelectParticleFromNeighbors(p); </w:t>
       </w:r>
       <w:r>
         <w:t>(g</w:t>
@@ -22908,13 +23197,8 @@
         </w:rPr>
         <w:t xml:space="preserve"> </w:t>
       </w:r>
-      <w:proofErr w:type="gramStart"/>
-      <w:r>
-        <w:t>Crossover(</w:t>
-      </w:r>
-      <w:proofErr w:type="gramEnd"/>
-      <w:r>
-        <w:t>p,</w:t>
+      <w:r>
+        <w:t>Crossover(p,</w:t>
       </w:r>
       <w:r>
         <w:rPr>
@@ -23089,17 +23373,7 @@
         <w:t xml:space="preserve">then </w:t>
       </w:r>
       <w:r>
-        <w:t>(g Replace(</w:t>
-      </w:r>
-      <w:proofErr w:type="spellStart"/>
-      <w:proofErr w:type="gramStart"/>
-      <w:r>
-        <w:t>p,off</w:t>
-      </w:r>
-      <w:proofErr w:type="spellEnd"/>
-      <w:proofErr w:type="gramEnd"/>
-      <w:r>
-        <w:t>);</w:t>
+        <w:t>(g Replace(p,off);</w:t>
       </w:r>
     </w:p>
     <w:p>
@@ -23388,7 +23662,7 @@
           <w:sz w:val="20"/>
         </w:rPr>
         <w:sectPr>
-          <w:footerReference w:type="default" r:id="rId13"/>
+          <w:footerReference w:type="default" r:id="rId14"/>
           <w:pgSz w:w="11910" w:h="16840"/>
           <w:pgMar w:top="860" w:right="980" w:bottom="1060" w:left="980" w:header="0" w:footer="876" w:gutter="0"/>
           <w:cols w:space="720"/>
@@ -24081,21 +24355,12 @@
               </w:rPr>
               <w:t xml:space="preserve"> </w:t>
             </w:r>
-            <w:proofErr w:type="spellStart"/>
             <w:r>
               <w:rPr>
                 <w:spacing w:val="-4"/>
                 <w:sz w:val="25"/>
               </w:rPr>
-              <w:t>Fregly</w:t>
-            </w:r>
-            <w:proofErr w:type="spellEnd"/>
-            <w:r>
-              <w:rPr>
-                <w:spacing w:val="-4"/>
-                <w:sz w:val="25"/>
-              </w:rPr>
-              <w:t>.</w:t>
+              <w:t>Fregly.</w:t>
             </w:r>
             <w:r>
               <w:rPr>
@@ -24382,7 +24647,7 @@
               </w:rPr>
               <w:t xml:space="preserve"> </w:t>
             </w:r>
-            <w:hyperlink r:id="rId14">
+            <w:hyperlink r:id="rId15">
               <w:r>
                 <w:rPr>
                   <w:color w:val="00AEEF"/>
@@ -24471,7 +24736,6 @@
               </w:rPr>
               <w:t xml:space="preserve"> </w:t>
             </w:r>
-            <w:proofErr w:type="spellStart"/>
             <w:r>
               <w:rPr>
                 <w:spacing w:val="-6"/>
@@ -24479,7 +24743,6 @@
               </w:rPr>
               <w:t>Storn</w:t>
             </w:r>
-            <w:proofErr w:type="spellEnd"/>
             <w:r>
               <w:rPr>
                 <w:spacing w:val="-10"/>
@@ -24871,7 +25134,7 @@
     </w:tbl>
     <w:p/>
     <w:sectPr>
-      <w:footerReference w:type="default" r:id="rId15"/>
+      <w:footerReference w:type="default" r:id="rId16"/>
       <w:pgSz w:w="11910" w:h="16840"/>
       <w:pgMar w:top="1920" w:right="980" w:bottom="1060" w:left="980" w:header="0" w:footer="876" w:gutter="0"/>
       <w:cols w:space="720"/>
@@ -27686,7 +27949,6 @@
   <w:style w:type="character" w:default="1" w:styleId="DefaultParagraphFont">
     <w:name w:val="Default Paragraph Font"/>
     <w:uiPriority w:val="1"/>
-    <w:semiHidden/>
     <w:unhideWhenUsed/>
   </w:style>
   <w:style w:type="table" w:default="1" w:styleId="TableNormal">

</xml_diff>

<commit_message>
Decision Tree pe 2 dataset-uri
</commit_message>
<xml_diff>
--- a/Raport.docx
+++ b/Raport.docx
@@ -1530,9 +1530,6 @@
         <w:pStyle w:val="BodyText"/>
         <w:spacing w:before="162"/>
         <w:ind w:left="492"/>
-        <w:rPr>
-          <w:color w:val="FFFFFF" w:themeColor="background1"/>
-        </w:rPr>
       </w:pPr>
       <w:r>
         <w:rPr>
@@ -1547,97 +1544,6 @@
           <w:spacing w:val="-12"/>
         </w:rPr>
         <w:t xml:space="preserve"> </w:t>
-      </w:r>
-      <w:r>
-        <w:rPr>
-          <w:color w:val="FFFFFF" w:themeColor="background1"/>
-          <w:spacing w:val="-2"/>
-        </w:rPr>
-        <w:t>add</w:t>
-      </w:r>
-      <w:r>
-        <w:rPr>
-          <w:color w:val="FFFFFF" w:themeColor="background1"/>
-          <w:spacing w:val="-11"/>
-        </w:rPr>
-        <w:t xml:space="preserve"> </w:t>
-      </w:r>
-      <w:r>
-        <w:rPr>
-          <w:color w:val="FFFFFF" w:themeColor="background1"/>
-          <w:spacing w:val="-2"/>
-        </w:rPr>
-        <w:t>a</w:t>
-      </w:r>
-      <w:r>
-        <w:rPr>
-          <w:color w:val="FFFFFF" w:themeColor="background1"/>
-          <w:spacing w:val="-11"/>
-        </w:rPr>
-        <w:t xml:space="preserve"> </w:t>
-      </w:r>
-      <w:r>
-        <w:rPr>
-          <w:color w:val="FFFFFF" w:themeColor="background1"/>
-          <w:spacing w:val="-2"/>
-        </w:rPr>
-        <w:t>graphical</w:t>
-      </w:r>
-      <w:r>
-        <w:rPr>
-          <w:color w:val="FFFFFF" w:themeColor="background1"/>
-          <w:spacing w:val="-12"/>
-        </w:rPr>
-        <w:t xml:space="preserve"> </w:t>
-      </w:r>
-      <w:r>
-        <w:rPr>
-          <w:color w:val="FFFFFF" w:themeColor="background1"/>
-          <w:spacing w:val="-2"/>
-        </w:rPr>
-        <w:t>abstract</w:t>
-      </w:r>
-      <w:r>
-        <w:rPr>
-          <w:color w:val="FFFFFF" w:themeColor="background1"/>
-          <w:spacing w:val="-11"/>
-        </w:rPr>
-        <w:t xml:space="preserve"> </w:t>
-      </w:r>
-      <w:r>
-        <w:rPr>
-          <w:color w:val="FFFFFF" w:themeColor="background1"/>
-          <w:spacing w:val="-2"/>
-        </w:rPr>
-        <w:t>of</w:t>
-      </w:r>
-      <w:r>
-        <w:rPr>
-          <w:color w:val="FFFFFF" w:themeColor="background1"/>
-          <w:spacing w:val="-11"/>
-        </w:rPr>
-        <w:t xml:space="preserve"> </w:t>
-      </w:r>
-      <w:r>
-        <w:rPr>
-          <w:color w:val="FFFFFF" w:themeColor="background1"/>
-          <w:spacing w:val="-2"/>
-        </w:rPr>
-        <w:t>your</w:t>
-      </w:r>
-      <w:r>
-        <w:rPr>
-          <w:color w:val="FFFFFF" w:themeColor="background1"/>
-          <w:spacing w:val="-11"/>
-        </w:rPr>
-        <w:t xml:space="preserve"> </w:t>
-      </w:r>
-      <w:r>
-        <w:rPr>
-          <w:color w:val="FFFFFF" w:themeColor="background1"/>
-          <w:spacing w:val="-2"/>
-        </w:rPr>
-        <w:t>work.</w:t>
       </w:r>
     </w:p>
     <w:p>
@@ -5000,7 +4906,19 @@
               <w:rPr>
                 <w:color w:val="FF0000"/>
               </w:rPr>
-              <w:t>Methodology</w:t>
+              <w:t>Methodol</w:t>
+            </w:r>
+            <w:r>
+              <w:rPr>
+                <w:color w:val="FF0000"/>
+              </w:rPr>
+              <w:t>o</w:t>
+            </w:r>
+            <w:r>
+              <w:rPr>
+                <w:color w:val="FF0000"/>
+              </w:rPr>
+              <w:t>gy</w:t>
             </w:r>
           </w:hyperlink>
           <w:r>
@@ -20442,7 +20360,6 @@
                                   <w:sz w:val="13"/>
                                 </w:rPr>
                               </w:pPr>
-                              <w:proofErr w:type="gramStart"/>
                               <w:r>
                                 <w:rPr>
                                   <w:rFonts w:ascii="Arial"/>
@@ -20471,7 +20388,6 @@
                                 </w:rPr>
                                 <w:t>5</w:t>
                               </w:r>
-                              <w:proofErr w:type="gramEnd"/>
                               <w:r>
                                 <w:rPr>
                                   <w:rFonts w:ascii="Arial"/>
@@ -20987,7 +20903,6 @@
                             <w:sz w:val="13"/>
                           </w:rPr>
                         </w:pPr>
-                        <w:proofErr w:type="gramStart"/>
                         <w:r>
                           <w:rPr>
                             <w:rFonts w:ascii="Arial"/>
@@ -21016,7 +20931,6 @@
                           </w:rPr>
                           <w:t>5</w:t>
                         </w:r>
-                        <w:proofErr w:type="gramEnd"/>
                         <w:r>
                           <w:rPr>
                             <w:rFonts w:ascii="Arial"/>

</xml_diff>